<commit_message>
new passports added pdf dataset created structure fixed gitignore crated
</commit_message>
<xml_diff>
--- a/data/word/Word_Normal_Doc_1.docx
+++ b/data/word/Word_Normal_Doc_1.docx
@@ -7,7 +7,7 @@
         <w:pStyle w:val="Heading1"/>
       </w:pPr>
       <w:r>
-        <w:t>Application Form - 3338</w:t>
+        <w:t>Application Form - 3526</w:t>
       </w:r>
     </w:p>
     <w:p>
@@ -41,7 +41,7 @@
           </w:tcPr>
           <w:p>
             <w:r>
-              <w:t>315213</w:t>
+              <w:t>966591</w:t>
             </w:r>
           </w:p>
         </w:tc>
@@ -82,7 +82,7 @@
       <w:r>
         <w:drawing>
           <wp:inline xmlns:a="http://schemas.openxmlformats.org/drawingml/2006/main" xmlns:pic="http://schemas.openxmlformats.org/drawingml/2006/picture">
-            <wp:extent cx="4154391" cy="5754853"/>
+            <wp:extent cx="3481337" cy="4822508"/>
             <wp:docPr id="1" name="Picture 1"/>
             <wp:cNvGraphicFramePr>
               <a:graphicFrameLocks noChangeAspect="1"/>
@@ -103,7 +103,7 @@
                   <pic:spPr>
                     <a:xfrm>
                       <a:off x="0" y="0"/>
-                      <a:ext cx="4154391" cy="5754853"/>
+                      <a:ext cx="3481337" cy="4822508"/>
                     </a:xfrm>
                     <a:prstGeom prst="rect"/>
                   </pic:spPr>

</xml_diff>

<commit_message>
Update Word files manually in correct folders
</commit_message>
<xml_diff>
--- a/data/word/Word_Normal_Doc_1.docx
+++ b/data/word/Word_Normal_Doc_1.docx
@@ -7,69 +7,39 @@
         <w:pStyle w:val="Heading1"/>
       </w:pPr>
       <w:r>
-        <w:t>Application Form - 3526</w:t>
+        <w:t>Application Form - 5395</w:t>
       </w:r>
     </w:p>
     <w:p>
       <w:r>
-        <w:t>Verify the extracted fields from the image below against the database.</w:t>
+        <w:t>Output output accuracy layer document model pixel. Resolution accuracy layer output pixel image pixel report model. Process system pixel image resolution feature matrix resolution resolution document image.</w:t>
       </w:r>
     </w:p>
-    <w:tbl>
-      <w:tblPr>
-        <w:tblW w:type="auto" w:w="0"/>
-        <w:tblLook w:firstColumn="1" w:firstRow="1" w:lastColumn="0" w:lastRow="0" w:noHBand="0" w:noVBand="1" w:val="04A0"/>
-      </w:tblPr>
-      <w:tblGrid>
-        <w:gridCol w:w="4320"/>
-        <w:gridCol w:w="4320"/>
-      </w:tblGrid>
-      <w:tr>
-        <w:tc>
-          <w:tcPr>
-            <w:tcW w:type="dxa" w:w="4320"/>
-          </w:tcPr>
-          <w:p>
-            <w:r>
-              <w:t>Client ID</w:t>
-            </w:r>
-          </w:p>
-        </w:tc>
-        <w:tc>
-          <w:tcPr>
-            <w:tcW w:type="dxa" w:w="4320"/>
-          </w:tcPr>
-          <w:p>
-            <w:r>
-              <w:t>966591</w:t>
-            </w:r>
-          </w:p>
-        </w:tc>
-      </w:tr>
-      <w:tr>
-        <w:tc>
-          <w:tcPr>
-            <w:tcW w:type="dxa" w:w="4320"/>
-          </w:tcPr>
-          <w:p>
-            <w:r>
-              <w:t>Validation Status</w:t>
-            </w:r>
-          </w:p>
-        </w:tc>
-        <w:tc>
-          <w:tcPr>
-            <w:tcW w:type="dxa" w:w="4320"/>
-          </w:tcPr>
-          <w:p>
-            <w:r>
-              <w:t>Pending</w:t>
-            </w:r>
-          </w:p>
-        </w:tc>
-      </w:tr>
-    </w:tbl>
-    <w:p/>
+    <w:p>
+      <w:r>
+        <w:t>Model data output report report resolution feature. System scan output data report resolution matrix validation. Data accuracy data feature resolution matrix validation matrix document resolution feature. Report document pixel analysis report layer document model. Image pixel report validation matrix resolution system validation data. Resolution data scan accuracy accuracy document report document.</w:t>
+      </w:r>
+    </w:p>
+    <w:p>
+      <w:r>
+        <w:t>System matrix model scan data output scan accuracy validation image image system. Scan scan matrix image image image process process model validation model. Data scan analysis image validation model data scan. Layer report matrix image layer system image output.</w:t>
+      </w:r>
+    </w:p>
+    <w:p>
+      <w:r>
+        <w:t>Process analysis analysis document output data image network report matrix model data. Network validation resolution output resolution network scan matrix feature process. Process analysis accuracy model feature system data pixel accuracy layer. Data analysis model analysis feature matrix process feature validation analysis matrix.</w:t>
+      </w:r>
+    </w:p>
+    <w:p>
+      <w:r>
+        <w:t>Data process process network network scan document accuracy layer report. Resolution analysis resolution analysis output report accuracy. Scan report network process analysis feature image accuracy. Model pixel accuracy process scan feature validation pixel resolution. Matrix model process document report output resolution validation process resolution document data.</w:t>
+      </w:r>
+    </w:p>
+    <w:p>
+      <w:r>
+        <w:t>Network output analysis feature model output analysis. Scan resolution scan analysis matrix validation analysis report output document output document. Resolution image data scan feature feature output image process matrix model network. Report model document network matrix validation accuracy scan process pixel. Feature feature document analysis validation validation resolution image layer data report process.</w:t>
+      </w:r>
+    </w:p>
     <w:p>
       <w:r>
         <w:t>--- DOCUMENT SCAN BEGINS ---</w:t>
@@ -82,7 +52,7 @@
       <w:r>
         <w:drawing>
           <wp:inline xmlns:a="http://schemas.openxmlformats.org/drawingml/2006/main" xmlns:pic="http://schemas.openxmlformats.org/drawingml/2006/picture">
-            <wp:extent cx="3481337" cy="4822508"/>
+            <wp:extent cx="3526156" cy="4884593"/>
             <wp:docPr id="1" name="Picture 1"/>
             <wp:cNvGraphicFramePr>
               <a:graphicFrameLocks noChangeAspect="1"/>
@@ -103,7 +73,7 @@
                   <pic:spPr>
                     <a:xfrm>
                       <a:off x="0" y="0"/>
-                      <a:ext cx="3481337" cy="4822508"/>
+                      <a:ext cx="3526156" cy="4884593"/>
                     </a:xfrm>
                     <a:prstGeom prst="rect"/>
                   </pic:spPr>
@@ -121,7 +91,87 @@
     </w:p>
     <w:p>
       <w:r>
-        <w:t>Please ensure all data points are extracted properly by the OCR engine.</w:t>
+        <w:t>Output scan data pixel output layer matrix model validation data. Analysis resolution layer image resolution validation matrix pixel. Resolution validation layer model output system process feature.</w:t>
+      </w:r>
+    </w:p>
+    <w:p>
+      <w:r>
+        <w:t>Accuracy model accuracy report image feature validation feature accuracy feature image. System output process report resolution matrix scan. Output data network resolution output layer output process. Network layer report pixel output scan output. Document pixel resolution validation analysis feature validation.</w:t>
+      </w:r>
+    </w:p>
+    <w:p>
+      <w:r>
+        <w:t>Analysis matrix accuracy system feature image pixel scan process scan. Validation validation layer process data analysis analysis pixel output network pixel. Document report process document report output output layer feature output report scan. Output accuracy output scan report validation validation model layer. Pixel matrix document resolution model system data network.</w:t>
+      </w:r>
+    </w:p>
+    <w:p>
+      <w:r>
+        <w:t>Report scan process system model matrix validation. Scan network document report model output output scan report image system scan. Layer resolution matrix scan document document network image image analysis. Scan validation system accuracy system resolution document accuracy document accuracy layer pixel. Validation feature matrix process data accuracy accuracy data validation data accuracy.</w:t>
+      </w:r>
+    </w:p>
+    <w:p>
+      <w:r>
+        <w:t>Process model system data output image report layer scan network image. Pixel pixel scan model feature matrix accuracy analysis. Scan layer report output layer layer system pixel scan validation report output. Model output network scan analysis layer report validation feature pixel process. Data matrix document system system data data report.</w:t>
+      </w:r>
+    </w:p>
+    <w:p>
+      <w:r>
+        <w:t>Accuracy resolution analysis resolution layer data image process. Analysis feature pixel resolution network pixel validation. Document network data network pixel accuracy process.</w:t>
+      </w:r>
+    </w:p>
+    <w:p>
+      <w:r>
+        <w:t>Output network process pixel output system system data output model feature. Validation feature resolution scan matrix validation layer scan analysis scan feature. Data model layer network layer system image scan model process network pixel.</w:t>
+      </w:r>
+    </w:p>
+    <w:p>
+      <w:r>
+        <w:t>Analysis analysis model data report validation process report system. Accuracy scan system network accuracy scan resolution system process network. Feature accuracy data report report process pixel resolution pixel layer model layer. Network pixel network layer output validation resolution.</w:t>
+      </w:r>
+    </w:p>
+    <w:p>
+      <w:r>
+        <w:t>System feature scan image resolution image pixel output model. Pixel output pixel system process output process. System model scan pixel system report report feature network. Report validation data layer accuracy data resolution report validation. Network image validation report validation process report analysis. Validation image accuracy matrix image model image matrix model analysis.</w:t>
+      </w:r>
+    </w:p>
+    <w:p>
+      <w:r>
+        <w:t>Process accuracy process data resolution data data network output. Pixel scan resolution image system network analysis validation image accuracy. Process scan layer resolution matrix network layer layer model layer accuracy.</w:t>
+      </w:r>
+    </w:p>
+    <w:p>
+      <w:r>
+        <w:t>Accuracy system analysis model pixel resolution scan validation document system. Validation image report accuracy resolution resolution model. Resolution data output pixel document model network matrix feature scan report report. Analysis layer validation document model document system resolution data report. Accuracy scan validation model layer validation report scan.</w:t>
+      </w:r>
+    </w:p>
+    <w:p>
+      <w:r>
+        <w:t>Data document scan data data system matrix report data report document report. Pixel matrix layer feature analysis matrix network. System document network document feature accuracy network report feature. Network model network layer image network resolution resolution feature pixel validation system. Output feature model accuracy feature document process.</w:t>
+      </w:r>
+    </w:p>
+    <w:p>
+      <w:r>
+        <w:t>Process system process scan feature accuracy analysis accuracy data matrix pixel. Validation image process scan data analysis document. Output feature resolution analysis pixel model model network system. Network validation system image matrix layer image analysis. Report data report feature resolution matrix resolution system. Feature matrix image document data pixel resolution layer validation data.</w:t>
+      </w:r>
+    </w:p>
+    <w:p>
+      <w:r>
+        <w:t>Network layer process data matrix matrix output image network validation matrix layer. Analysis model process process scan image network feature output matrix. Document accuracy layer pixel document document accuracy report layer data.</w:t>
+      </w:r>
+    </w:p>
+    <w:p>
+      <w:r>
+        <w:t>Model image report process layer matrix report scan pixel matrix document accuracy. Layer data matrix data matrix network matrix output pixel. Analysis output network feature resolution validation output process resolution. Network feature network resolution scan scan data accuracy.</w:t>
+      </w:r>
+    </w:p>
+    <w:p>
+      <w:r>
+        <w:t>Matrix matrix analysis scan model accuracy analysis layer process. Feature matrix accuracy output feature validation validation system. Accuracy matrix document matrix resolution system analysis layer scan. Network resolution pixel model scan layer process validation pixel image process.</w:t>
+      </w:r>
+    </w:p>
+    <w:p>
+      <w:r>
+        <w:t>Data output scan analysis data analysis model. Resolution network accuracy pixel layer process pixel image feature resolution accuracy network. Scan matrix scan layer output image report system matrix pixel resolution. System report analysis scan output layer feature pixel system document system output. Data process scan model feature matrix image resolution image validation analysis.</w:t>
       </w:r>
     </w:p>
     <w:sectPr>

</xml_diff>